<commit_message>
Use supplied lab 3 title page for DataLens lab 4 report
</commit_message>
<xml_diff>
--- a/lab4_datalens/lab4_datalens_report_checked.docx
+++ b/lab4_datalens/lab4_datalens_report_checked.docx
@@ -4,158 +4,943 @@
   <w:body>
     <w:p>
       <w:pPr>
-        <w:spacing w:line="240" w:lineRule="auto" w:after="240"/>
-        <w:ind w:firstLine="0"/>
+        <w:pStyle w:val="TitleSource_a3"/>
+        <w:spacing w:before="76" w:line="658" w:lineRule="auto"/>
+        <w:ind w:left="4099" w:right="3952"/>
         <w:jc w:val="center"/>
       </w:pPr>
       <w:r>
         <w:rPr>
-          <w:rFonts w:ascii="Times New Roman" w:hAnsi="Times New Roman"/>
-          <w:color w:val="000000"/>
-          <w:sz w:val="28"/>
+          <w:spacing w:val="-4"/>
         </w:rPr>
-        <w:t>МИНИСТЕРСТВО НАУКИ И ВЫСШЕГО ОБРАЗОВАНИЯ</w:t>
-        <w:br/>
-        <w:t>РОССИЙСКОЙ ФЕДЕРАЦИИ</w:t>
+        <w:t xml:space="preserve">ГУАП </w:t>
+      </w:r>
+      <w:r>
+        <w:t>КАФЕДРА</w:t>
+      </w:r>
+      <w:r>
+        <w:rPr>
+          <w:spacing w:val="-15"/>
+        </w:rPr>
+        <w:t xml:space="preserve"> </w:t>
+      </w:r>
+      <w:r>
+        <w:t>№</w:t>
+      </w:r>
+      <w:r>
+        <w:rPr>
+          <w:spacing w:val="-15"/>
+        </w:rPr>
+        <w:t xml:space="preserve"> </w:t>
+      </w:r>
+      <w:r>
+        <w:t>41</w:t>
       </w:r>
     </w:p>
     <w:p>
       <w:pPr>
-        <w:spacing w:line="240" w:lineRule="auto" w:after="240"/>
-        <w:ind w:firstLine="0"/>
+        <w:pStyle w:val="TitleSource_a3"/>
+      </w:pPr>
+    </w:p>
+    <w:p>
+      <w:pPr>
+        <w:pStyle w:val="TitleSource_a3"/>
+        <w:spacing w:before="167"/>
+      </w:pPr>
+    </w:p>
+    <w:p>
+      <w:pPr>
+        <w:pStyle w:val="TitleSource_a3"/>
+      </w:pPr>
+      <w:r>
+        <w:rPr>
+          <w:spacing w:val="-2"/>
+        </w:rPr>
+        <w:t>ОТЧЕТ</w:t>
+      </w:r>
+    </w:p>
+    <w:p>
+      <w:pPr>
+        <w:pStyle w:val="TitleSource_a3"/>
+        <w:spacing w:line="343" w:lineRule="auto"/>
+        <w:ind w:right="5093"/>
+      </w:pPr>
+      <w:r>
+        <w:t>ЗАЩИЩЕН</w:t>
+      </w:r>
+      <w:r>
+        <w:rPr>
+          <w:spacing w:val="-15"/>
+        </w:rPr>
+        <w:t xml:space="preserve"> </w:t>
+      </w:r>
+      <w:r>
+        <w:t>С</w:t>
+      </w:r>
+      <w:r>
+        <w:rPr>
+          <w:spacing w:val="-15"/>
+        </w:rPr>
+        <w:t xml:space="preserve"> </w:t>
+      </w:r>
+      <w:r>
+        <w:t xml:space="preserve">ОЦЕНКОЙ </w:t>
+      </w:r>
+      <w:r>
+        <w:rPr>
+          <w:spacing w:val="-2"/>
+        </w:rPr>
+        <w:t>ПРЕПОДАВАТЕЛЬ</w:t>
+      </w:r>
+    </w:p>
+    <w:p>
+      <w:pPr>
+        <w:pStyle w:val="TitleSource_a3"/>
+        <w:tabs>
+          <w:tab w:val="left" w:pos="6696"/>
+        </w:tabs>
+        <w:spacing w:before="82" w:line="320" w:lineRule="exact"/>
+        <w:ind w:left="372"/>
         <w:jc w:val="center"/>
       </w:pPr>
       <w:r>
         <w:rPr>
-          <w:rFonts w:ascii="Times New Roman" w:hAnsi="Times New Roman"/>
-          <w:b/>
-          <w:color w:val="000000"/>
-          <w:sz w:val="28"/>
+          <w:noProof/>
+          <w:lang w:eastAsia="ru-RU"/>
         </w:rPr>
-        <w:t>САНКТ-ПЕТЕРБУРГСКИЙ ГОСУДАРСТВЕННЫЙ</w:t>
-        <w:br/>
-        <w:t>УНИВЕРСИТЕТ АЭРОКОСМИЧЕСКОГО</w:t>
-        <w:br/>
-        <w:t>ПРИБОРОСТРОЕНИЯ</w:t>
+        <mc:AlternateContent>
+          <mc:Choice Requires="wps">
+            <w:drawing>
+              <wp:anchor distT="0" distB="0" distL="0" distR="0" simplePos="0" relativeHeight="487587840" behindDoc="1" locked="0" layoutInCell="1" allowOverlap="1">
+                <wp:simplePos x="0" y="0"/>
+                <wp:positionH relativeFrom="page">
+                  <wp:posOffset>1059180</wp:posOffset>
+                </wp:positionH>
+                <wp:positionV relativeFrom="paragraph">
+                  <wp:posOffset>266334</wp:posOffset>
+                </wp:positionV>
+                <wp:extent cx="2060575" cy="6350"/>
+                <wp:effectExtent l="0" t="0" r="0" b="0"/>
+                <wp:wrapTopAndBottom/>
+                <wp:docPr id="1" name="Graphic 1"/>
+                <wp:cNvGraphicFramePr>
+                  <a:graphicFrameLocks xmlns:a="http://schemas.openxmlformats.org/drawingml/2006/main"/>
+                </wp:cNvGraphicFramePr>
+                <a:graphic xmlns:a="http://schemas.openxmlformats.org/drawingml/2006/main">
+                  <a:graphicData uri="http://schemas.microsoft.com/office/word/2010/wordprocessingShape">
+                    <wps:wsp>
+                      <wps:cNvSpPr>
+                        <a:spLocks/>
+                      </wps:cNvSpPr>
+                      <wps:spPr>
+                        <a:xfrm>
+                          <a:off x="0" y="0"/>
+                          <a:ext cx="2060575" cy="6350"/>
+                        </a:xfrm>
+                        <a:custGeom>
+                          <a:avLst/>
+                          <a:gdLst/>
+                          <a:ahLst/>
+                          <a:cxnLst/>
+                          <a:rect l="l" t="t" r="r" b="b"/>
+                          <a:pathLst>
+                            <a:path w="2060575" h="6350">
+                              <a:moveTo>
+                                <a:pt x="2060447" y="6096"/>
+                              </a:moveTo>
+                              <a:lnTo>
+                                <a:pt x="0" y="6096"/>
+                              </a:lnTo>
+                              <a:lnTo>
+                                <a:pt x="0" y="0"/>
+                              </a:lnTo>
+                              <a:lnTo>
+                                <a:pt x="2060447" y="0"/>
+                              </a:lnTo>
+                              <a:lnTo>
+                                <a:pt x="2060447" y="6096"/>
+                              </a:lnTo>
+                              <a:close/>
+                            </a:path>
+                          </a:pathLst>
+                        </a:custGeom>
+                        <a:solidFill>
+                          <a:srgbClr val="000000"/>
+                        </a:solidFill>
+                      </wps:spPr>
+                      <wps:bodyPr wrap="square" lIns="0" tIns="0" rIns="0" bIns="0" rtlCol="0">
+                        <a:prstTxWarp prst="textNoShape">
+                          <a:avLst/>
+                        </a:prstTxWarp>
+                        <a:noAutofit/>
+                      </wps:bodyPr>
+                    </wps:wsp>
+                  </a:graphicData>
+                </a:graphic>
+              </wp:anchor>
+            </w:drawing>
+          </mc:Choice>
+          <mc:Fallback>
+            <w:pict>
+              <v:shape w14:anchorId="07583456" id="Graphic 1" o:spid="_x0000_s1026" style="position:absolute;margin-left:83.4pt;margin-top:20.95pt;width:162.25pt;height:.5pt;z-index:-15728640;visibility:visible;mso-wrap-style:square;mso-wrap-distance-left:0;mso-wrap-distance-top:0;mso-wrap-distance-right:0;mso-wrap-distance-bottom:0;mso-position-horizontal:absolute;mso-position-horizontal-relative:page;mso-position-vertical:absolute;mso-position-vertical-relative:text;v-text-anchor:top" coordsize="2060575,6350" o:gfxdata="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" path="m2060447,6096l,6096,,,2060447,r,6096xe" fillcolor="black" stroked="f">
+                <v:path arrowok="t"/>
+                <w10:wrap type="topAndBottom" anchorx="page"/>
+              </v:shape>
+            </w:pict>
+          </mc:Fallback>
+        </mc:AlternateContent>
+      </w:r>
+      <w:r>
+        <w:rPr>
+          <w:noProof/>
+          <w:lang w:eastAsia="ru-RU"/>
+        </w:rPr>
+        <mc:AlternateContent>
+          <mc:Choice Requires="wps">
+            <w:drawing>
+              <wp:anchor distT="0" distB="0" distL="0" distR="0" simplePos="0" relativeHeight="487588352" behindDoc="1" locked="0" layoutInCell="1" allowOverlap="1">
+                <wp:simplePos x="0" y="0"/>
+                <wp:positionH relativeFrom="page">
+                  <wp:posOffset>3299460</wp:posOffset>
+                </wp:positionH>
+                <wp:positionV relativeFrom="paragraph">
+                  <wp:posOffset>266334</wp:posOffset>
+                </wp:positionV>
+                <wp:extent cx="1790700" cy="6350"/>
+                <wp:effectExtent l="0" t="0" r="0" b="0"/>
+                <wp:wrapTopAndBottom/>
+                <wp:docPr id="2" name="Graphic 2"/>
+                <wp:cNvGraphicFramePr>
+                  <a:graphicFrameLocks xmlns:a="http://schemas.openxmlformats.org/drawingml/2006/main"/>
+                </wp:cNvGraphicFramePr>
+                <a:graphic xmlns:a="http://schemas.openxmlformats.org/drawingml/2006/main">
+                  <a:graphicData uri="http://schemas.microsoft.com/office/word/2010/wordprocessingShape">
+                    <wps:wsp>
+                      <wps:cNvSpPr>
+                        <a:spLocks/>
+                      </wps:cNvSpPr>
+                      <wps:spPr>
+                        <a:xfrm>
+                          <a:off x="0" y="0"/>
+                          <a:ext cx="1790700" cy="6350"/>
+                        </a:xfrm>
+                        <a:custGeom>
+                          <a:avLst/>
+                          <a:gdLst/>
+                          <a:ahLst/>
+                          <a:cxnLst/>
+                          <a:rect l="l" t="t" r="r" b="b"/>
+                          <a:pathLst>
+                            <a:path w="1790700" h="6350">
+                              <a:moveTo>
+                                <a:pt x="1790700" y="6096"/>
+                              </a:moveTo>
+                              <a:lnTo>
+                                <a:pt x="0" y="6096"/>
+                              </a:lnTo>
+                              <a:lnTo>
+                                <a:pt x="0" y="0"/>
+                              </a:lnTo>
+                              <a:lnTo>
+                                <a:pt x="1790700" y="0"/>
+                              </a:lnTo>
+                              <a:lnTo>
+                                <a:pt x="1790700" y="6096"/>
+                              </a:lnTo>
+                              <a:close/>
+                            </a:path>
+                          </a:pathLst>
+                        </a:custGeom>
+                        <a:solidFill>
+                          <a:srgbClr val="000000"/>
+                        </a:solidFill>
+                      </wps:spPr>
+                      <wps:bodyPr wrap="square" lIns="0" tIns="0" rIns="0" bIns="0" rtlCol="0">
+                        <a:prstTxWarp prst="textNoShape">
+                          <a:avLst/>
+                        </a:prstTxWarp>
+                        <a:noAutofit/>
+                      </wps:bodyPr>
+                    </wps:wsp>
+                  </a:graphicData>
+                </a:graphic>
+              </wp:anchor>
+            </w:drawing>
+          </mc:Choice>
+          <mc:Fallback>
+            <w:pict>
+              <v:shape w14:anchorId="30C2723F" id="Graphic 2" o:spid="_x0000_s1026" style="position:absolute;margin-left:259.8pt;margin-top:20.95pt;width:141pt;height:.5pt;z-index:-15728128;visibility:visible;mso-wrap-style:square;mso-wrap-distance-left:0;mso-wrap-distance-top:0;mso-wrap-distance-right:0;mso-wrap-distance-bottom:0;mso-position-horizontal:absolute;mso-position-horizontal-relative:page;mso-position-vertical:absolute;mso-position-vertical-relative:text;v-text-anchor:top" coordsize="1790700,6350" o:gfxdata="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" path="m1790700,6096l,6096,,,1790700,r,6096xe" fillcolor="black" stroked="f">
+                <v:path arrowok="t"/>
+                <w10:wrap type="topAndBottom" anchorx="page"/>
+              </v:shape>
+            </w:pict>
+          </mc:Fallback>
+        </mc:AlternateContent>
+      </w:r>
+      <w:r>
+        <w:rPr>
+          <w:noProof/>
+          <w:lang w:eastAsia="ru-RU"/>
+        </w:rPr>
+        <mc:AlternateContent>
+          <mc:Choice Requires="wps">
+            <w:drawing>
+              <wp:anchor distT="0" distB="0" distL="0" distR="0" simplePos="0" relativeHeight="487588864" behindDoc="1" locked="0" layoutInCell="1" allowOverlap="1">
+                <wp:simplePos x="0" y="0"/>
+                <wp:positionH relativeFrom="page">
+                  <wp:posOffset>5266944</wp:posOffset>
+                </wp:positionH>
+                <wp:positionV relativeFrom="paragraph">
+                  <wp:posOffset>266334</wp:posOffset>
+                </wp:positionV>
+                <wp:extent cx="1912620" cy="6350"/>
+                <wp:effectExtent l="0" t="0" r="0" b="0"/>
+                <wp:wrapTopAndBottom/>
+                <wp:docPr id="3" name="Graphic 3"/>
+                <wp:cNvGraphicFramePr>
+                  <a:graphicFrameLocks xmlns:a="http://schemas.openxmlformats.org/drawingml/2006/main"/>
+                </wp:cNvGraphicFramePr>
+                <a:graphic xmlns:a="http://schemas.openxmlformats.org/drawingml/2006/main">
+                  <a:graphicData uri="http://schemas.microsoft.com/office/word/2010/wordprocessingShape">
+                    <wps:wsp>
+                      <wps:cNvSpPr>
+                        <a:spLocks/>
+                      </wps:cNvSpPr>
+                      <wps:spPr>
+                        <a:xfrm>
+                          <a:off x="0" y="0"/>
+                          <a:ext cx="1912620" cy="6350"/>
+                        </a:xfrm>
+                        <a:custGeom>
+                          <a:avLst/>
+                          <a:gdLst/>
+                          <a:ahLst/>
+                          <a:cxnLst/>
+                          <a:rect l="l" t="t" r="r" b="b"/>
+                          <a:pathLst>
+                            <a:path w="1912620" h="6350">
+                              <a:moveTo>
+                                <a:pt x="1912619" y="6096"/>
+                              </a:moveTo>
+                              <a:lnTo>
+                                <a:pt x="0" y="6096"/>
+                              </a:lnTo>
+                              <a:lnTo>
+                                <a:pt x="0" y="0"/>
+                              </a:lnTo>
+                              <a:lnTo>
+                                <a:pt x="1912619" y="0"/>
+                              </a:lnTo>
+                              <a:lnTo>
+                                <a:pt x="1912619" y="6096"/>
+                              </a:lnTo>
+                              <a:close/>
+                            </a:path>
+                          </a:pathLst>
+                        </a:custGeom>
+                        <a:solidFill>
+                          <a:srgbClr val="000000"/>
+                        </a:solidFill>
+                      </wps:spPr>
+                      <wps:bodyPr wrap="square" lIns="0" tIns="0" rIns="0" bIns="0" rtlCol="0">
+                        <a:prstTxWarp prst="textNoShape">
+                          <a:avLst/>
+                        </a:prstTxWarp>
+                        <a:noAutofit/>
+                      </wps:bodyPr>
+                    </wps:wsp>
+                  </a:graphicData>
+                </a:graphic>
+              </wp:anchor>
+            </w:drawing>
+          </mc:Choice>
+          <mc:Fallback>
+            <w:pict>
+              <v:shape w14:anchorId="39BAF2CE" id="Graphic 3" o:spid="_x0000_s1026" style="position:absolute;margin-left:414.7pt;margin-top:20.95pt;width:150.6pt;height:.5pt;z-index:-15727616;visibility:visible;mso-wrap-style:square;mso-wrap-distance-left:0;mso-wrap-distance-top:0;mso-wrap-distance-right:0;mso-wrap-distance-bottom:0;mso-position-horizontal:absolute;mso-position-horizontal-relative:page;mso-position-vertical:absolute;mso-position-vertical-relative:text;v-text-anchor:top" coordsize="1912620,6350" o:gfxdata="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" path="m1912619,6096l,6096,,,1912619,r,6096xe" fillcolor="black" stroked="f">
+                <v:path arrowok="t"/>
+                <w10:wrap type="topAndBottom" anchorx="page"/>
+              </v:shape>
+            </w:pict>
+          </mc:Fallback>
+        </mc:AlternateContent>
+      </w:r>
+      <w:r>
+        <w:rPr>
+          <w:spacing w:val="-2"/>
+          <w:position w:val="6"/>
+        </w:rPr>
+        <w:t>Ассистент</w:t>
+      </w:r>
+      <w:r>
+        <w:rPr>
+          <w:position w:val="6"/>
+        </w:rPr>
+        <w:tab/>
+      </w:r>
+      <w:r>
+        <w:t>Д.С.</w:t>
+      </w:r>
+      <w:r>
+        <w:rPr>
+          <w:spacing w:val="-1"/>
+        </w:rPr>
+        <w:t xml:space="preserve"> </w:t>
+      </w:r>
+      <w:r>
+        <w:rPr>
+          <w:spacing w:val="-2"/>
+        </w:rPr>
+        <w:t>Лисюков</w:t>
       </w:r>
     </w:p>
     <w:p>
       <w:pPr>
-        <w:spacing w:line="240" w:lineRule="auto" w:after="240"/>
-        <w:ind w:firstLine="0"/>
-        <w:jc w:val="center"/>
+        <w:pStyle w:val="TitleSource_a"/>
+        <w:tabs>
+          <w:tab w:val="left" w:pos="4462"/>
+          <w:tab w:val="left" w:pos="7383"/>
+        </w:tabs>
+        <w:spacing w:line="187" w:lineRule="exact"/>
+        <w:ind w:left="411"/>
+        <w:rPr>
+          <w:sz w:val="20"/>
+        </w:rPr>
       </w:pPr>
       <w:r>
         <w:rPr>
-          <w:rFonts w:ascii="Times New Roman" w:hAnsi="Times New Roman"/>
-          <w:color w:val="000000"/>
-          <w:sz w:val="28"/>
+          <w:sz w:val="20"/>
         </w:rPr>
-        <w:t>КАФЕДРА № 41</w:t>
+        <w:t>должность,</w:t>
+      </w:r>
+      <w:r>
+        <w:rPr>
+          <w:spacing w:val="-8"/>
+          <w:sz w:val="20"/>
+        </w:rPr>
+        <w:t xml:space="preserve"> </w:t>
+      </w:r>
+      <w:r>
+        <w:rPr>
+          <w:sz w:val="20"/>
+        </w:rPr>
+        <w:t>уч.</w:t>
+      </w:r>
+      <w:r>
+        <w:rPr>
+          <w:spacing w:val="-7"/>
+          <w:sz w:val="20"/>
+        </w:rPr>
+        <w:t xml:space="preserve"> </w:t>
+      </w:r>
+      <w:r>
+        <w:rPr>
+          <w:sz w:val="20"/>
+        </w:rPr>
+        <w:t>степень,</w:t>
+      </w:r>
+      <w:r>
+        <w:rPr>
+          <w:spacing w:val="-7"/>
+          <w:sz w:val="20"/>
+        </w:rPr>
+        <w:t xml:space="preserve"> </w:t>
+      </w:r>
+      <w:r>
+        <w:rPr>
+          <w:spacing w:val="-2"/>
+          <w:sz w:val="20"/>
+        </w:rPr>
+        <w:t>звание</w:t>
+      </w:r>
+      <w:r>
+        <w:rPr>
+          <w:sz w:val="20"/>
+        </w:rPr>
+        <w:tab/>
+        <w:t>подпись,</w:t>
+      </w:r>
+      <w:r>
+        <w:rPr>
+          <w:spacing w:val="-8"/>
+          <w:sz w:val="20"/>
+        </w:rPr>
+        <w:t xml:space="preserve"> </w:t>
+      </w:r>
+      <w:r>
+        <w:rPr>
+          <w:spacing w:val="-4"/>
+          <w:sz w:val="20"/>
+        </w:rPr>
+        <w:t>дата</w:t>
+      </w:r>
+      <w:r>
+        <w:rPr>
+          <w:sz w:val="20"/>
+        </w:rPr>
+        <w:tab/>
+        <w:t>инициалы,</w:t>
+      </w:r>
+      <w:r>
+        <w:rPr>
+          <w:spacing w:val="-8"/>
+          <w:sz w:val="20"/>
+        </w:rPr>
+        <w:t xml:space="preserve"> </w:t>
+      </w:r>
+      <w:r>
+        <w:rPr>
+          <w:spacing w:val="-2"/>
+          <w:sz w:val="20"/>
+        </w:rPr>
+        <w:t>фамилия</w:t>
       </w:r>
     </w:p>
     <w:p>
       <w:pPr>
-        <w:spacing w:line="240" w:lineRule="auto" w:after="240"/>
-        <w:ind w:firstLine="0"/>
+        <w:pStyle w:val="TitleSource_a3"/>
+        <w:rPr>
+          <w:sz w:val="28"/>
+        </w:rPr>
+      </w:pPr>
+    </w:p>
+    <w:p>
+      <w:pPr>
+        <w:pStyle w:val="TitleSource_a3"/>
+        <w:rPr>
+          <w:sz w:val="28"/>
+        </w:rPr>
+      </w:pPr>
+    </w:p>
+    <w:p>
+      <w:pPr>
+        <w:pStyle w:val="TitleSource_a3"/>
+        <w:spacing w:before="308"/>
+        <w:rPr>
+          <w:sz w:val="28"/>
+        </w:rPr>
+      </w:pPr>
+    </w:p>
+    <w:p>
+      <w:pPr>
+        <w:pStyle w:val="TitleSource_a"/>
+        <w:ind w:left="76"/>
         <w:jc w:val="center"/>
+        <w:rPr>
+          <w:sz w:val="28"/>
+        </w:rPr>
       </w:pPr>
       <w:r>
         <w:rPr>
-          <w:rFonts w:ascii="Times New Roman" w:hAnsi="Times New Roman"/>
-          <w:b/>
-          <w:color w:val="000000"/>
           <w:sz w:val="28"/>
         </w:rPr>
-        <w:br/>
-        <w:t>ОТЧЁТ</w:t>
-        <w:br/>
-        <w:t>О ПРАКТИЧЕСКОЙ РАБОТЕ № 4</w:t>
+        <w:t>ОТЧЕТ</w:t>
+      </w:r>
+      <w:r>
+        <w:rPr>
+          <w:spacing w:val="-8"/>
+          <w:sz w:val="28"/>
+        </w:rPr>
+        <w:t xml:space="preserve"> </w:t>
+      </w:r>
+      <w:r>
+        <w:rPr>
+          <w:sz w:val="28"/>
+        </w:rPr>
+        <w:t>О</w:t>
+      </w:r>
+      <w:r>
+        <w:rPr>
+          <w:spacing w:val="-3"/>
+          <w:sz w:val="28"/>
+        </w:rPr>
+        <w:t xml:space="preserve"> </w:t>
+      </w:r>
+      <w:r>
+        <w:rPr>
+          <w:sz w:val="28"/>
+        </w:rPr>
+        <w:t>ЛАБОРАТОРНОЙ</w:t>
+      </w:r>
+      <w:r>
+        <w:rPr>
+          <w:spacing w:val="-3"/>
+          <w:sz w:val="28"/>
+        </w:rPr>
+        <w:t xml:space="preserve"> </w:t>
+      </w:r>
+      <w:r>
+        <w:rPr>
+          <w:sz w:val="28"/>
+        </w:rPr>
+        <w:t>РАБОТЕ</w:t>
+      </w:r>
+      <w:r>
+        <w:rPr>
+          <w:spacing w:val="-7"/>
+          <w:sz w:val="28"/>
+        </w:rPr>
+        <w:t xml:space="preserve"> №4</w:t>
       </w:r>
     </w:p>
     <w:p>
       <w:pPr>
-        <w:spacing w:line="240" w:lineRule="auto" w:after="240"/>
-        <w:ind w:firstLine="0"/>
-        <w:jc w:val="center"/>
+        <w:pStyle w:val="TitleSource_a3"/>
+        <w:rPr>
+          <w:sz w:val="28"/>
+        </w:rPr>
+      </w:pPr>
+    </w:p>
+    <w:p>
+      <w:pPr>
+        <w:pStyle w:val="TitleSource_a3"/>
+        <w:spacing w:before="76"/>
+        <w:rPr>
+          <w:sz w:val="28"/>
+        </w:rPr>
+      </w:pPr>
+    </w:p>
+    <w:p>
+      <w:pPr>
+        <w:pStyle w:val="TitleSource_1"/>
       </w:pPr>
       <w:r>
+        <w:t xml:space="preserve">Знакомство с Yandex DataLens</w:t>
+      </w:r>
+      <w:r>
         <w:rPr>
-          <w:rFonts w:ascii="Times New Roman" w:hAnsi="Times New Roman"/>
-          <w:color w:val="000000"/>
-          <w:sz w:val="28"/>
+          <w:lang w:val="en-US"/>
         </w:rPr>
-        <w:t>Знакомство с Yandex DataLens</w:t>
+        <w:t/>
       </w:r>
     </w:p>
     <w:p>
       <w:pPr>
-        <w:spacing w:line="240" w:lineRule="auto" w:after="240"/>
-        <w:ind w:firstLine="0"/>
+        <w:pStyle w:val="TitleSource_a3"/>
+        <w:rPr>
+          <w:sz w:val="28"/>
+        </w:rPr>
+      </w:pPr>
+    </w:p>
+    <w:p>
+      <w:pPr>
+        <w:pStyle w:val="TitleSource_a3"/>
+        <w:spacing w:before="194"/>
+        <w:rPr>
+          <w:sz w:val="28"/>
+        </w:rPr>
+      </w:pPr>
+    </w:p>
+    <w:p>
+      <w:pPr>
+        <w:pStyle w:val="TitleSource_a3"/>
+        <w:spacing w:before="1"/>
+        <w:ind w:left="76"/>
         <w:jc w:val="center"/>
       </w:pPr>
       <w:r>
+        <w:t>по</w:t>
+      </w:r>
+      <w:r>
         <w:rPr>
-          <w:rFonts w:ascii="Times New Roman" w:hAnsi="Times New Roman"/>
-          <w:color w:val="000000"/>
-          <w:sz w:val="28"/>
+          <w:spacing w:val="-1"/>
         </w:rPr>
-        <w:br/>
-        <w:t>По дисциплине: [название дисциплины]</w:t>
+        <w:t xml:space="preserve"> </w:t>
+      </w:r>
+      <w:r>
+        <w:t>курсу:</w:t>
+      </w:r>
+      <w:r>
+        <w:rPr>
+          <w:spacing w:val="-1"/>
+        </w:rPr>
+        <w:t xml:space="preserve"> </w:t>
+      </w:r>
+      <w:r>
+        <w:t>Облачные</w:t>
+      </w:r>
+      <w:r>
+        <w:rPr>
+          <w:spacing w:val="-1"/>
+        </w:rPr>
+        <w:t xml:space="preserve"> </w:t>
+      </w:r>
+      <w:r>
+        <w:t>технологии</w:t>
+      </w:r>
+      <w:r>
+        <w:rPr>
+          <w:spacing w:val="2"/>
+        </w:rPr>
+        <w:t xml:space="preserve"> </w:t>
+      </w:r>
+      <w:r>
+        <w:t xml:space="preserve">и </w:t>
+      </w:r>
+      <w:r>
+        <w:rPr>
+          <w:spacing w:val="-2"/>
+        </w:rPr>
+        <w:t>сервисы</w:t>
       </w:r>
     </w:p>
     <w:p>
       <w:pPr>
-        <w:spacing w:line="240" w:lineRule="auto" w:after="240"/>
-        <w:ind w:firstLine="0"/>
-        <w:jc w:val="left"/>
+        <w:pStyle w:val="TitleSource_a3"/>
+      </w:pPr>
+    </w:p>
+    <w:p>
+      <w:pPr>
+        <w:pStyle w:val="TitleSource_a3"/>
+      </w:pPr>
+    </w:p>
+    <w:p>
+      <w:pPr>
+        <w:pStyle w:val="TitleSource_a3"/>
+      </w:pPr>
+    </w:p>
+    <w:p>
+      <w:pPr>
+        <w:pStyle w:val="TitleSource_a3"/>
+      </w:pPr>
+    </w:p>
+    <w:p>
+      <w:pPr>
+        <w:pStyle w:val="TitleSource_a3"/>
+      </w:pPr>
+    </w:p>
+    <w:p>
+      <w:pPr>
+        <w:pStyle w:val="TitleSource_a3"/>
+      </w:pPr>
+    </w:p>
+    <w:p>
+      <w:pPr>
+        <w:pStyle w:val="TitleSource_a3"/>
+      </w:pPr>
+    </w:p>
+    <w:p>
+      <w:pPr>
+        <w:pStyle w:val="TitleSource_a3"/>
+      </w:pPr>
+    </w:p>
+    <w:p>
+      <w:pPr>
+        <w:pStyle w:val="TitleSource_a3"/>
+        <w:spacing w:before="36"/>
+      </w:pPr>
+    </w:p>
+    <w:p>
+      <w:pPr>
+        <w:pStyle w:val="TitleSource_a3"/>
       </w:pPr>
       <w:r>
+        <w:t>РАБОТУ</w:t>
+      </w:r>
+      <w:r>
         <w:rPr>
-          <w:rFonts w:ascii="Times New Roman" w:hAnsi="Times New Roman"/>
-          <w:color w:val="000000"/>
-          <w:sz w:val="28"/>
+          <w:spacing w:val="-2"/>
         </w:rPr>
-        <w:br/>
-        <w:br/>
-        <w:t>РАБОТУ ВЫПОЛНИЛ</w:t>
-        <w:br/>
-        <w:t>Студент группы 4417                         М. П. Курбатов</w:t>
-        <w:br/>
-        <w:br/>
-        <w:t>ПРОВЕРИЛ</w:t>
-        <w:br/>
-        <w:t>[должность и Ф. И. О. преподавателя]</w:t>
+        <w:t xml:space="preserve"> ВЫПОЛНИЛ</w:t>
       </w:r>
     </w:p>
     <w:p>
       <w:pPr>
-        <w:spacing w:line="240" w:lineRule="auto" w:after="240" w:before="2200"/>
-        <w:ind w:firstLine="0"/>
+        <w:pStyle w:val="TitleSource_a3"/>
+        <w:tabs>
+          <w:tab w:val="left" w:pos="2276"/>
+          <w:tab w:val="left" w:pos="2900"/>
+          <w:tab w:val="left" w:pos="4008"/>
+          <w:tab w:val="left" w:pos="4244"/>
+          <w:tab w:val="left" w:pos="6940"/>
+          <w:tab w:val="left" w:pos="7640"/>
+          <w:tab w:val="left" w:pos="9747"/>
+        </w:tabs>
+        <w:spacing w:before="257" w:line="260" w:lineRule="exact"/>
+        <w:ind w:left="108"/>
+      </w:pPr>
+      <w:r>
+        <w:t xml:space="preserve">СТУДЕНТ ГР. </w:t>
+      </w:r>
+      <w:r>
+        <w:rPr>
+          <w:spacing w:val="-10"/>
+        </w:rPr>
+        <w:t>№</w:t>
+      </w:r>
+      <w:r>
+        <w:tab/>
+      </w:r>
+      <w:r>
+        <w:rPr>
+          <w:u w:val="single"/>
+        </w:rPr>
+        <w:tab/>
+      </w:r>
+      <w:r>
+        <w:rPr>
+          <w:spacing w:val="-4"/>
+          <w:u w:val="single"/>
+        </w:rPr>
+        <w:t>4417</w:t>
+      </w:r>
+      <w:r>
+        <w:rPr>
+          <w:u w:val="single"/>
+        </w:rPr>
+        <w:tab/>
+      </w:r>
+      <w:r>
+        <w:tab/>
+      </w:r>
+      <w:r>
+        <w:rPr>
+          <w:u w:val="single"/>
+        </w:rPr>
+        <w:tab/>
+      </w:r>
+      <w:r>
+        <w:rPr>
+          <w:spacing w:val="118"/>
+        </w:rPr>
+        <w:t xml:space="preserve"> </w:t>
+      </w:r>
+      <w:r>
+        <w:rPr>
+          <w:u w:val="single"/>
+        </w:rPr>
+        <w:tab/>
+      </w:r>
+      <w:r>
+        <w:rPr>
+          <w:u w:val="single"/>
+        </w:rPr>
+        <w:t>М. П. Курбатов</w:t>
+      </w:r>
+      <w:r>
+        <w:rPr>
+          <w:u w:val="single"/>
+        </w:rPr>
+        <w:tab/>
+      </w:r>
+    </w:p>
+    <w:p>
+      <w:pPr>
+        <w:pStyle w:val="TitleSource_a"/>
+        <w:tabs>
+          <w:tab w:val="left" w:pos="7575"/>
+        </w:tabs>
+        <w:spacing w:line="214" w:lineRule="exact"/>
+        <w:ind w:left="4976"/>
+        <w:rPr>
+          <w:sz w:val="20"/>
+        </w:rPr>
+      </w:pPr>
+      <w:r>
+        <w:rPr>
+          <w:sz w:val="20"/>
+        </w:rPr>
+        <w:t>подпись,</w:t>
+      </w:r>
+      <w:r>
+        <w:rPr>
+          <w:spacing w:val="-8"/>
+          <w:sz w:val="20"/>
+        </w:rPr>
+        <w:t xml:space="preserve"> </w:t>
+      </w:r>
+      <w:r>
+        <w:rPr>
+          <w:spacing w:val="-4"/>
+          <w:sz w:val="20"/>
+        </w:rPr>
+        <w:t>дата</w:t>
+      </w:r>
+      <w:r>
+        <w:rPr>
+          <w:sz w:val="20"/>
+        </w:rPr>
+        <w:tab/>
+        <w:t>инициалы,</w:t>
+      </w:r>
+      <w:r>
+        <w:rPr>
+          <w:spacing w:val="-8"/>
+          <w:sz w:val="20"/>
+        </w:rPr>
+        <w:t xml:space="preserve"> </w:t>
+      </w:r>
+      <w:r>
+        <w:rPr>
+          <w:spacing w:val="-2"/>
+          <w:sz w:val="20"/>
+        </w:rPr>
+        <w:t>фамилия</w:t>
+      </w:r>
+    </w:p>
+    <w:p>
+      <w:pPr>
+        <w:pStyle w:val="TitleSource_a3"/>
+      </w:pPr>
+    </w:p>
+    <w:p>
+      <w:pPr>
+        <w:pStyle w:val="TitleSource_a3"/>
+      </w:pPr>
+    </w:p>
+    <w:p>
+      <w:pPr>
+        <w:pStyle w:val="TitleSource_a3"/>
+      </w:pPr>
+    </w:p>
+    <w:p>
+      <w:pPr>
+        <w:pStyle w:val="TitleSource_a3"/>
+      </w:pPr>
+    </w:p>
+    <w:p>
+      <w:pPr>
+        <w:pStyle w:val="TitleSource_a3"/>
+      </w:pPr>
+    </w:p>
+    <w:p>
+      <w:pPr>
+        <w:pStyle w:val="TitleSource_a3"/>
+      </w:pPr>
+    </w:p>
+    <w:p>
+      <w:pPr>
+        <w:pStyle w:val="TitleSource_a3"/>
+        <w:spacing w:before="90"/>
+      </w:pPr>
+    </w:p>
+    <w:p>
+      <w:pPr>
+        <w:pStyle w:val="TitleSource_a3"/>
+        <w:ind w:left="147"/>
         <w:jc w:val="center"/>
       </w:pPr>
       <w:r>
+        <w:t xml:space="preserve">Санкт-Петербург </w:t>
+      </w:r>
+      <w:r>
         <w:rPr>
-          <w:rFonts w:ascii="Times New Roman" w:hAnsi="Times New Roman"/>
-          <w:color w:val="000000"/>
-          <w:sz w:val="28"/>
+          <w:spacing w:val="-4"/>
         </w:rPr>
-        <w:br/>
-        <w:br/>
-        <w:t>Санкт-Петербург</w:t>
-        <w:br/>
         <w:t>2026</w:t>
       </w:r>
     </w:p>
     <w:p>
-      <w:r>
-        <w:rPr>
-          <w:rFonts w:ascii="Times New Roman" w:hAnsi="Times New Roman"/>
-          <w:color w:val="000000"/>
-          <w:sz w:val="28"/>
-        </w:rPr>
-        <w:br w:type="page"/>
-      </w:r>
+      <w:pPr>
+        <w:pStyle w:val="TitleSource_a3"/>
+        <w:jc w:val="center"/>
+        <w:sectPr>
+          <w:type w:val="nextPage"/>
+          <w:pgSz w:w="11910" w:h="16840"/>
+          <w:pgMar w:top="1220" w:right="566" w:bottom="280" w:left="1559" w:header="720" w:footer="720" w:gutter="0"/>
+          <w:cols w:space="720"/>
+          <w:titlePg/>
+        </w:sectPr>
+      </w:pPr>
     </w:p>
     <w:p>
       <w:pPr>
@@ -1791,7 +2576,6 @@
       <w:pgSz w:w="11906" w:h="16838"/>
       <w:pgMar w:top="1134" w:right="850" w:bottom="1134" w:left="1701" w:header="567" w:footer="567" w:gutter="0"/>
       <w:cols w:space="720"/>
-      <w:titlePg/>
       <w:docGrid w:linePitch="360"/>
     </w:sectPr>
   </w:body>
@@ -13871,6 +14655,179 @@
         <w:shd w:val="clear" w:color="auto" w:fill="FBCAA2" w:themeFill="accent6" w:themeFillTint="7F"/>
       </w:tcPr>
     </w:tblStylePr>
+  </w:style>
+  <w:style w:type="paragraph" w:styleId="TitleSource_a">
+    <w:name w:val="Title source Normal"/>
+    <w:uiPriority w:val="1"/>
+    <w:qFormat/>
+    <w:rPr>
+      <w:rFonts w:ascii="Times New Roman" w:eastAsia="Times New Roman" w:hAnsi="Times New Roman" w:cs="Times New Roman"/>
+      <w:lang w:val="ru-RU"/>
+      <w:sz w:val="22"/>
+      <w:szCs w:val="22"/>
+    </w:rPr>
+    <w:pPr>
+      <w:spacing w:before="0" w:after="0" w:line="240" w:lineRule="auto"/>
+    </w:pPr>
+  </w:style>
+  <w:style w:type="paragraph" w:styleId="TitleSource_1">
+    <w:name w:val="Title source heading 1"/>
+    <w:basedOn w:val="TitleSource_a"/>
+    <w:uiPriority w:val="1"/>
+    <w:qFormat/>
+    <w:pPr>
+      <w:ind w:left="74"/>
+      <w:jc w:val="center"/>
+      <w:outlineLvl w:val="0"/>
+    </w:pPr>
+    <w:rPr>
+      <w:sz w:val="28"/>
+      <w:szCs w:val="28"/>
+    </w:rPr>
+  </w:style>
+  <w:style w:type="paragraph" w:styleId="TitleSource_2">
+    <w:name w:val="Title source heading 2"/>
+    <w:basedOn w:val="TitleSource_a"/>
+    <w:uiPriority w:val="1"/>
+    <w:qFormat/>
+    <w:pPr>
+      <w:spacing w:before="73"/>
+      <w:ind w:left="850"/>
+      <w:outlineLvl w:val="1"/>
+    </w:pPr>
+    <w:rPr>
+      <w:b/>
+      <w:bCs/>
+      <w:sz w:val="24"/>
+      <w:szCs w:val="24"/>
+    </w:rPr>
+  </w:style>
+  <w:style w:type="character" w:styleId="TitleSource_a0">
+    <w:name w:val="Title source Default Paragraph Font"/>
+    <w:uiPriority w:val="1"/>
+    <w:semiHidden/>
+    <w:unhideWhenUsed/>
+  </w:style>
+  <w:style w:type="table" w:styleId="TitleSource_a1">
+    <w:name w:val="Title source Normal Table"/>
+    <w:uiPriority w:val="99"/>
+    <w:semiHidden/>
+    <w:unhideWhenUsed/>
+    <w:tblPr>
+      <w:tblInd w:w="0" w:type="dxa"/>
+      <w:tblCellMar>
+        <w:top w:w="0" w:type="dxa"/>
+        <w:left w:w="108" w:type="dxa"/>
+        <w:bottom w:w="0" w:type="dxa"/>
+        <w:right w:w="108" w:type="dxa"/>
+      </w:tblCellMar>
+    </w:tblPr>
+  </w:style>
+  <w:style w:type="numbering" w:styleId="TitleSource_a2">
+    <w:name w:val="Title source No List"/>
+    <w:uiPriority w:val="99"/>
+    <w:semiHidden/>
+    <w:unhideWhenUsed/>
+  </w:style>
+  <w:style w:type="table" w:customStyle="1" w:styleId="TitleSource_TableNormal">
+    <w:name w:val="Title source Table Normal"/>
+    <w:uiPriority w:val="2"/>
+    <w:semiHidden/>
+    <w:unhideWhenUsed/>
+    <w:qFormat/>
+    <w:tblPr>
+      <w:tblInd w:w="0" w:type="dxa"/>
+      <w:tblCellMar>
+        <w:top w:w="0" w:type="dxa"/>
+        <w:left w:w="0" w:type="dxa"/>
+        <w:bottom w:w="0" w:type="dxa"/>
+        <w:right w:w="0" w:type="dxa"/>
+      </w:tblCellMar>
+    </w:tblPr>
+  </w:style>
+  <w:style w:type="paragraph" w:styleId="TitleSource_a3">
+    <w:name w:val="Title source Body Text"/>
+    <w:basedOn w:val="TitleSource_a"/>
+    <w:uiPriority w:val="1"/>
+    <w:qFormat/>
+    <w:rPr>
+      <w:sz w:val="24"/>
+      <w:szCs w:val="24"/>
+    </w:rPr>
+  </w:style>
+  <w:style w:type="paragraph" w:styleId="TitleSource_a4">
+    <w:name w:val="Title source List Paragraph"/>
+    <w:basedOn w:val="TitleSource_a"/>
+    <w:uiPriority w:val="1"/>
+    <w:qFormat/>
+    <w:pPr>
+      <w:spacing w:before="1"/>
+      <w:ind w:left="1117" w:hanging="267"/>
+      <w:jc w:val="both"/>
+    </w:pPr>
+  </w:style>
+  <w:style w:type="paragraph" w:customStyle="1" w:styleId="TitleSource_TableParagraph">
+    <w:name w:val="Title source Table Paragraph"/>
+    <w:basedOn w:val="TitleSource_a"/>
+    <w:uiPriority w:val="1"/>
+    <w:qFormat/>
+  </w:style>
+  <w:style w:type="paragraph" w:styleId="TitleSource_a5">
+    <w:name w:val="Title source footer"/>
+    <w:basedOn w:val="TitleSource_a"/>
+    <w:link w:val="TitleSource_a6"/>
+    <w:uiPriority w:val="99"/>
+    <w:unhideWhenUsed/>
+    <w:rsid w:val="00A9742A"/>
+    <w:pPr>
+      <w:widowControl/>
+      <w:tabs>
+        <w:tab w:val="center" w:pos="4680"/>
+        <w:tab w:val="right" w:pos="9360"/>
+      </w:tabs>
+      <w:autoSpaceDE/>
+      <w:autoSpaceDN/>
+    </w:pPr>
+    <w:rPr>
+      <w:rFonts w:eastAsiaTheme="minorEastAsia" w:cstheme="minorBidi"/>
+      <w:sz w:val="24"/>
+      <w:lang w:val="en-US"/>
+    </w:rPr>
+  </w:style>
+  <w:style w:type="character" w:customStyle="1" w:styleId="TitleSource_a6">
+    <w:name w:val="Title source Нижний колонтитул Знак"/>
+    <w:basedOn w:val="TitleSource_a0"/>
+    <w:link w:val="TitleSource_a5"/>
+    <w:uiPriority w:val="99"/>
+    <w:rsid w:val="00A9742A"/>
+    <w:rPr>
+      <w:rFonts w:ascii="Times New Roman" w:eastAsiaTheme="minorEastAsia" w:hAnsi="Times New Roman"/>
+      <w:sz w:val="24"/>
+    </w:rPr>
+  </w:style>
+  <w:style w:type="table" w:styleId="TitleSource_a7">
+    <w:name w:val="Title source Table Grid"/>
+    <w:basedOn w:val="TitleSource_a1"/>
+    <w:uiPriority w:val="59"/>
+    <w:rsid w:val="00A9742A"/>
+    <w:pPr>
+      <w:widowControl/>
+      <w:autoSpaceDE/>
+      <w:autoSpaceDN/>
+    </w:pPr>
+    <w:rPr>
+      <w:rFonts w:eastAsiaTheme="minorEastAsia"/>
+    </w:rPr>
+    <w:tblPr>
+      <w:tblBorders>
+        <w:top w:val="single" w:sz="4" w:space="0" w:color="auto"/>
+        <w:left w:val="single" w:sz="4" w:space="0" w:color="auto"/>
+        <w:bottom w:val="single" w:sz="4" w:space="0" w:color="auto"/>
+        <w:right w:val="single" w:sz="4" w:space="0" w:color="auto"/>
+        <w:insideH w:val="single" w:sz="4" w:space="0" w:color="auto"/>
+        <w:insideV w:val="single" w:sz="4" w:space="0" w:color="auto"/>
+      </w:tblBorders>
+    </w:tblPr>
   </w:style>
 </w:styles>
 </file>

</xml_diff>